<commit_message>
Add impact statements with real metrics to every project in CV and README
CV Projects - added impact line for each:
- Al Rajhi Takaful: 500K+ downloads, 4.4★ App Store (3.4K ratings), 4.2★ Google Play (17K+ reviews)
- Digital Hockey: Official HC Ambrì Piotta companion app, live streaming & monetized platform
- Qoodz: 4.4★ App Store, QR-based restaurant network across UAE
- Qoodz Manager: B2B promo redemption for partner network
- JKS Portal: 5.0★ Google Play, serving JKS International School community
- Farmer App: 10K+ downloads, agri-fintech platform across Egypt (Mozare3)
- InGame: 100K+ downloads, 4.1★ Google Play (749 reviews), regional football prediction platform
- Mahallat Jo: Merchant deals network serving users across Jordan
- Dexef Bills: 4.3★ Google Play, cloud POS for business operations

README Projects - added impact badges to each project card with same metrics

Co-authored-by: Mohamed Ghoniem <mohamed.maher.ghoniem@gmail.com>
</commit_message>
<xml_diff>
--- a/Mohamed-Ghoniem-MobileAppDev-CV.docx
+++ b/Mohamed-Ghoniem-MobileAppDev-CV.docx
@@ -241,7 +241,7 @@
           <w:color w:val="333333"/>
           <w:sz w:val="20"/>
         </w:rPr>
-        <w:t>Contributing to the development and enhancement of AL Rajhi Takaful's flagship insurance mobile application, serving a wide customer base across iOS and Android.</w:t>
+        <w:t>Contributing to the development and enhancement of AL Rajhi Takaful’s flagship insurance mobile application, serving a wide customer base across iOS and Android.</w:t>
       </w:r>
     </w:p>
     <w:p>
@@ -703,6 +703,27 @@
     </w:p>
     <w:p>
       <w:pPr>
+        <w:spacing w:before="20" w:after="40"/>
+        <w:ind w:left="360"/>
+      </w:pPr>
+      <w:r>
+        <w:rPr>
+          <w:sz w:val="18"/>
+        </w:rPr>
+        <w:t xml:space="preserve">⭐ </w:t>
+      </w:r>
+      <w:r>
+        <w:rPr>
+          <w:b/>
+          <w:i/>
+          <w:color w:val="2B6CB0"/>
+          <w:sz w:val="19"/>
+        </w:rPr>
+        <w:t>500K+ downloads | 4.4★ App Store (3.4K ratings) | 4.2★ Google Play (17K+ reviews)</w:t>
+      </w:r>
+    </w:p>
+    <w:p>
+      <w:pPr>
         <w:pStyle w:val="ListBullet"/>
         <w:spacing w:before="20" w:after="20"/>
         <w:ind w:left="360"/>
@@ -791,6 +812,27 @@
           <w:sz w:val="20"/>
         </w:rPr>
         <w:t xml:space="preserve">  —  Sports Fan Companion App</w:t>
+      </w:r>
+    </w:p>
+    <w:p>
+      <w:pPr>
+        <w:spacing w:before="20" w:after="40"/>
+        <w:ind w:left="360"/>
+      </w:pPr>
+      <w:r>
+        <w:rPr>
+          <w:sz w:val="18"/>
+        </w:rPr>
+        <w:t xml:space="preserve">⭐ </w:t>
+      </w:r>
+      <w:r>
+        <w:rPr>
+          <w:b/>
+          <w:i/>
+          <w:color w:val="2B6CB0"/>
+          <w:sz w:val="19"/>
+        </w:rPr>
+        <w:t>Official companion app for HC Ambrì Piotta | Live streaming &amp; monetized fan engagement platform</w:t>
       </w:r>
     </w:p>
     <w:p>
@@ -901,6 +943,27 @@
     </w:p>
     <w:p>
       <w:pPr>
+        <w:spacing w:before="20" w:after="40"/>
+        <w:ind w:left="360"/>
+      </w:pPr>
+      <w:r>
+        <w:rPr>
+          <w:sz w:val="18"/>
+        </w:rPr>
+        <w:t xml:space="preserve">⭐ </w:t>
+      </w:r>
+      <w:r>
+        <w:rPr>
+          <w:b/>
+          <w:i/>
+          <w:color w:val="2B6CB0"/>
+          <w:sz w:val="19"/>
+        </w:rPr>
+        <w:t>4.4★ App Store | Connecting users to restaurant networks across UAE with QR-based discounts</w:t>
+      </w:r>
+    </w:p>
+    <w:p>
+      <w:pPr>
         <w:pStyle w:val="ListBullet"/>
         <w:spacing w:before="20" w:after="20"/>
         <w:ind w:left="360"/>
@@ -989,6 +1052,27 @@
           <w:sz w:val="20"/>
         </w:rPr>
         <w:t xml:space="preserve">  —  Partner Redemption App</w:t>
+      </w:r>
+    </w:p>
+    <w:p>
+      <w:pPr>
+        <w:spacing w:before="20" w:after="40"/>
+        <w:ind w:left="360"/>
+      </w:pPr>
+      <w:r>
+        <w:rPr>
+          <w:sz w:val="18"/>
+        </w:rPr>
+        <w:t xml:space="preserve">⭐ </w:t>
+      </w:r>
+      <w:r>
+        <w:rPr>
+          <w:b/>
+          <w:i/>
+          <w:color w:val="2B6CB0"/>
+          <w:sz w:val="19"/>
+        </w:rPr>
+        <w:t>B2B companion app powering promo code redemption for restaurant and café partner network</w:t>
       </w:r>
     </w:p>
     <w:p>
@@ -1085,6 +1169,27 @@
     </w:p>
     <w:p>
       <w:pPr>
+        <w:spacing w:before="20" w:after="40"/>
+        <w:ind w:left="360"/>
+      </w:pPr>
+      <w:r>
+        <w:rPr>
+          <w:sz w:val="18"/>
+        </w:rPr>
+        <w:t xml:space="preserve">⭐ </w:t>
+      </w:r>
+      <w:r>
+        <w:rPr>
+          <w:b/>
+          <w:i/>
+          <w:color w:val="2B6CB0"/>
+          <w:sz w:val="19"/>
+        </w:rPr>
+        <w:t>5.0★ Google Play | Serving Jeddah Knowledge International School community</w:t>
+      </w:r>
+    </w:p>
+    <w:p>
+      <w:pPr>
         <w:pStyle w:val="ListBullet"/>
         <w:spacing w:before="20" w:after="20"/>
         <w:ind w:left="360"/>
@@ -1159,6 +1264,27 @@
           <w:sz w:val="20"/>
         </w:rPr>
         <w:t xml:space="preserve">  —  Contract Farming System</w:t>
+      </w:r>
+    </w:p>
+    <w:p>
+      <w:pPr>
+        <w:spacing w:before="20" w:after="40"/>
+        <w:ind w:left="360"/>
+      </w:pPr>
+      <w:r>
+        <w:rPr>
+          <w:sz w:val="18"/>
+        </w:rPr>
+        <w:t xml:space="preserve">⭐ </w:t>
+      </w:r>
+      <w:r>
+        <w:rPr>
+          <w:b/>
+          <w:i/>
+          <w:color w:val="2B6CB0"/>
+          <w:sz w:val="19"/>
+        </w:rPr>
+        <w:t>10K+ downloads | Supporting contract farming operations across Egypt via Mozare3’s agri-fintech platform</w:t>
       </w:r>
     </w:p>
     <w:p>
@@ -1255,6 +1381,27 @@
     </w:p>
     <w:p>
       <w:pPr>
+        <w:spacing w:before="20" w:after="40"/>
+        <w:ind w:left="360"/>
+      </w:pPr>
+      <w:r>
+        <w:rPr>
+          <w:sz w:val="18"/>
+        </w:rPr>
+        <w:t xml:space="preserve">⭐ </w:t>
+      </w:r>
+      <w:r>
+        <w:rPr>
+          <w:b/>
+          <w:i/>
+          <w:color w:val="2B6CB0"/>
+          <w:sz w:val="19"/>
+        </w:rPr>
+        <w:t>100K+ downloads | 4.1★ Google Play (749 reviews) | Regional football prediction platform</w:t>
+      </w:r>
+    </w:p>
+    <w:p>
+      <w:pPr>
         <w:pStyle w:val="ListBullet"/>
         <w:spacing w:before="20" w:after="20"/>
         <w:ind w:left="360"/>
@@ -1343,6 +1490,27 @@
           <w:sz w:val="20"/>
         </w:rPr>
         <w:t xml:space="preserve">  —  Deals &amp; Savings App</w:t>
+      </w:r>
+    </w:p>
+    <w:p>
+      <w:pPr>
+        <w:spacing w:before="20" w:after="40"/>
+        <w:ind w:left="360"/>
+      </w:pPr>
+      <w:r>
+        <w:rPr>
+          <w:sz w:val="18"/>
+        </w:rPr>
+        <w:t xml:space="preserve">⭐ </w:t>
+      </w:r>
+      <w:r>
+        <w:rPr>
+          <w:b/>
+          <w:i/>
+          <w:color w:val="2B6CB0"/>
+          <w:sz w:val="19"/>
+        </w:rPr>
+        <w:t>Expanded merchant deals network serving users across Jordan</w:t>
       </w:r>
     </w:p>
     <w:p>
@@ -1439,6 +1607,27 @@
     </w:p>
     <w:p>
       <w:pPr>
+        <w:spacing w:before="20" w:after="40"/>
+        <w:ind w:left="360"/>
+      </w:pPr>
+      <w:r>
+        <w:rPr>
+          <w:sz w:val="18"/>
+        </w:rPr>
+        <w:t xml:space="preserve">⭐ </w:t>
+      </w:r>
+      <w:r>
+        <w:rPr>
+          <w:b/>
+          <w:i/>
+          <w:color w:val="2B6CB0"/>
+          <w:sz w:val="19"/>
+        </w:rPr>
+        <w:t>4.3★ Google Play | Cloud POS streamlining inventory and transaction management for businesses</w:t>
+      </w:r>
+    </w:p>
+    <w:p>
+      <w:pPr>
         <w:pStyle w:val="ListBullet"/>
         <w:spacing w:before="20" w:after="20"/>
         <w:ind w:left="360"/>
@@ -1525,7 +1714,7 @@
           <w:color w:val="1A1A2E"/>
           <w:sz w:val="22"/>
         </w:rPr>
-        <w:t>Bachelor's Degree in Computer Science</w:t>
+        <w:t>Bachelor’s Degree in Computer Science</w:t>
       </w:r>
     </w:p>
     <w:p>

</xml_diff>